<commit_message>
court(njsupct): petition for writ gated on all three engines (fb-595.54.72)
Co-Authored-By: Claude Opus 5.5 <noreply@anthropic.com>
</commit_message>
<xml_diff>
--- a/courts/third-circuit/new-jersey/state/supreme-court/petition-for-writ/usage/OUTPUT-petition-for-writ.docx
+++ b/courts/third-circuit/new-jersey/state/supreme-court/petition-for-writ/usage/OUTPUT-petition-for-writ.docx
@@ -3337,7 +3337,7 @@
         <w:tab/>
       </w:r>
       <w:r>
-        <w:t xml:space="preserve">The New Jersey Constitution also provides for action by this Court to invalidate an unlawful map adopted by the NJRC and remanding for further proceedings, with Article II, Section II, Paragraph 9 stating that in the event “a plan certified by the commission is declared unlawful,” the NJRC “shall reorganize and adopt another Congressional district plan in the same manner as herein required . . . .”</w:t>
+        <w:t xml:space="preserve">The New Jersey Constitution also provides for action by this Court to invalidate an unlawful map adopted by the NJRC and remanding for further proceedings, with Article II, Section II, Paragraph 9 stating that in the event “a plan certified by the commission is declared unlawful,” the NJRC “shall reorganize and adopt another Congressional district plan in the same manner as herein required . . . .”</w:t>
       </w:r>
     </w:p>
     <w:p>
@@ -6844,6 +6844,33 @@
     <w:pPr>
       <w:spacing w:before="0" w:after="0" w:line="322" w:lineRule="exact"/>
       <w:ind w:left="2160" w:hanging="720"/>
+    </w:pPr>
+  </w:style>
+  <w:style w:type="paragraph" w:customStyle="1" w:styleId="XdQuoteList1">
+    <w:name w:val="Xd Quote List 1"/>
+    <w:basedOn w:val="Normal"/>
+    <w:qFormat/>
+    <w:pPr>
+      <w:spacing w:before="0" w:after="0" w:line="322" w:lineRule="exact"/>
+      <w:ind w:left="1440" w:right="720" w:hanging="720"/>
+    </w:pPr>
+  </w:style>
+  <w:style w:type="paragraph" w:customStyle="1" w:styleId="XdQuoteList2">
+    <w:name w:val="Xd Quote List 2"/>
+    <w:basedOn w:val="Normal"/>
+    <w:qFormat/>
+    <w:pPr>
+      <w:spacing w:before="0" w:after="0" w:line="322" w:lineRule="exact"/>
+      <w:ind w:left="2160" w:right="720" w:hanging="720"/>
+    </w:pPr>
+  </w:style>
+  <w:style w:type="paragraph" w:customStyle="1" w:styleId="XdQuoteList3">
+    <w:name w:val="Xd Quote List 3"/>
+    <w:basedOn w:val="Normal"/>
+    <w:qFormat/>
+    <w:pPr>
+      <w:spacing w:before="0" w:after="0" w:line="322" w:lineRule="exact"/>
+      <w:ind w:left="2880" w:right="720" w:hanging="720"/>
     </w:pPr>
   </w:style>
   <w:style w:type="paragraph" w:customStyle="1" w:styleId="XdList1">

</xml_diff>